<commit_message>
update code by Mewwi
</commit_message>
<xml_diff>
--- a/public/templates/doctorate_template.docx
+++ b/public/templates/doctorate_template.docx
@@ -263,7 +263,7 @@
           <w:sz w:val="32"/>
           <w:szCs w:val="32"/>
         </w:rPr>
-        <w:object w:dxaOrig="1440" w:dyaOrig="1440" w14:anchorId="088F695A">
+        <w:object w:dxaOrig="1440" w:dyaOrig="1440" w14:anchorId="394CB96D">
           <v:shapetype id="_x0000_t75" coordsize="21600,21600" o:spt="75" o:preferrelative="t" path="m@4@5l@4@11@9@11@9@5xe" filled="f" stroked="f">
             <v:stroke joinstyle="miter"/>
             <v:formulas>
@@ -287,7 +287,7 @@
             <v:imagedata r:id="rId8" o:title=""/>
             <w10:wrap anchory="page"/>
           </v:shape>
-          <o:OLEObject Type="Embed" ProgID="Word.Picture.8" ShapeID="_x0000_s2050" DrawAspect="Content" ObjectID="_1839407373" r:id="rId9"/>
+          <o:OLEObject Type="Embed" ProgID="Word.Picture.8" ShapeID="_x0000_s2050" DrawAspect="Content" ObjectID="_1840775891" r:id="rId9"/>
         </w:object>
       </w:r>
     </w:p>
@@ -314,7 +314,23 @@
           <w:sz w:val="32"/>
           <w:szCs w:val="32"/>
         </w:rPr>
-        <w:t>{{docNumber}}</w:t>
+        <w:t>{{</w:t>
+      </w:r>
+      <w:r>
+        <w:rPr>
+          <w:rFonts w:ascii="TH SarabunPSK" w:hAnsi="TH SarabunPSK" w:cs="TH SarabunPSK"/>
+          <w:sz w:val="32"/>
+          <w:szCs w:val="32"/>
+        </w:rPr>
+        <w:t>docNumber</w:t>
+      </w:r>
+      <w:r>
+        <w:rPr>
+          <w:rFonts w:ascii="TH SarabunPSK" w:hAnsi="TH SarabunPSK" w:cs="TH SarabunPSK"/>
+          <w:sz w:val="32"/>
+          <w:szCs w:val="32"/>
+        </w:rPr>
+        <w:t>}}</w:t>
       </w:r>
       <w:r>
         <w:rPr>
@@ -1484,7 +1500,7 @@
           <w:tab w:val="left" w:pos="4253"/>
         </w:tabs>
         <w:rPr>
-          <w:rFonts w:ascii="TH SarabunPSK" w:hAnsi="TH SarabunPSK" w:cs="TH SarabunPSK" w:hint="cs"/>
+          <w:rFonts w:ascii="TH SarabunPSK" w:hAnsi="TH SarabunPSK" w:cs="TH SarabunPSK"/>
           <w:color w:val="0000FF"/>
           <w:u w:val="single"/>
           <w:cs/>
@@ -3304,6 +3320,7 @@
   <w:style w:type="character" w:default="1" w:styleId="a0">
     <w:name w:val="Default Paragraph Font"/>
     <w:uiPriority w:val="1"/>
+    <w:semiHidden/>
     <w:unhideWhenUsed/>
   </w:style>
   <w:style w:type="table" w:default="1" w:styleId="a1">

</xml_diff>